<commit_message>
refactor(template): make extraction object-driven
</commit_message>
<xml_diff>
--- a/evals/template-extraction/cases/01-hunau-undergraduate/gold/template.docx
+++ b/evals/template-extraction/cases/01-hunau-undergraduate/gold/template.docx
@@ -109,7 +109,7 @@
               <w:rFonts w:eastAsia="黑体"/>
               <w:b/>
               <w:bCs/>
-              <w:color w:val="000000"/>
+              <w:color w:val="7F7F7F"/>
               <w:sz w:val="36"/>
               <w:szCs w:val="36"/>
             </w:rPr>
@@ -141,10 +141,11 @@
           <w:r>
             <w:rPr>
               <w:rFonts w:ascii="Times New Roman" w:hAnsi="Times New Roman" w:cs="Times New Roman"/>
+              <w:b/>
+              <w:bCs/>
+              <w:color w:val="7F7F7F"/>
               <w:sz w:val="28"/>
               <w:szCs w:val="28"/>
-              <w:b/>
-              <w:bCs/>
             </w:rPr>
             <w:t>【TITLE OF GRADUATION PAPER】</w:t>
           </w:r>
@@ -228,7 +229,7 @@
               <w:rFonts w:eastAsia="楷体_GB2312;楷体"/>
               <w:b/>
               <w:bCs/>
-              <w:color w:val="000000"/>
+              <w:color w:val="7F7F7F"/>
               <w:sz w:val="32"/>
               <w:szCs w:val="32"/>
             </w:rPr>
@@ -275,7 +276,7 @@
               <w:rFonts w:eastAsia="楷体_GB2312;楷体"/>
               <w:b/>
               <w:bCs/>
-              <w:color w:val="000000"/>
+              <w:color w:val="7F7F7F"/>
               <w:sz w:val="32"/>
               <w:szCs w:val="32"/>
             </w:rPr>
@@ -322,7 +323,7 @@
               <w:rFonts w:eastAsia="楷体_GB2312;楷体"/>
               <w:b/>
               <w:bCs/>
-              <w:color w:val="000000"/>
+              <w:color w:val="7F7F7F"/>
               <w:sz w:val="32"/>
               <w:szCs w:val="32"/>
             </w:rPr>
@@ -369,7 +370,7 @@
               <w:rFonts w:eastAsia="楷体_GB2312;楷体"/>
               <w:b/>
               <w:bCs/>
-              <w:color w:val="000000"/>
+              <w:color w:val="7F7F7F"/>
               <w:sz w:val="32"/>
               <w:szCs w:val="32"/>
             </w:rPr>
@@ -416,7 +417,7 @@
               <w:rFonts w:eastAsia="楷体_GB2312;楷体"/>
               <w:b/>
               <w:bCs/>
-              <w:color w:val="000000"/>
+              <w:color w:val="7F7F7F"/>
               <w:sz w:val="32"/>
               <w:szCs w:val="32"/>
             </w:rPr>
@@ -493,7 +494,7 @@
           <w:footerReference w:type="default" r:id="rId7"/>
           <w:type w:val="nextPage"/>
           <w:pgSz w:w="11906" w:h="16838"/>
-          <w:pgMar w:top="1440" w:right="1474" w:bottom="1440" w:left="1474" w:header="851" w:footer="992" w:gutter="0"/>
+          <w:pgMar w:top="1134" w:right="1474" w:bottom="1134" w:left="1474" w:header="851" w:footer="992" w:gutter="0"/>
           <w:cols w:space="720"/>
           <w:formProt w:val="0"/>
           <w:docGrid w:type="lines" w:linePitch="312"/>
@@ -520,7 +521,7 @@
           <w:r>
             <w:rPr>
               <w:rFonts w:eastAsia="黑体"/>
-              <w:color w:val="000000"/>
+              <w:color w:val="7F7F7F"/>
               <w:sz w:val="30"/>
               <w:szCs w:val="30"/>
             </w:rPr>
@@ -832,7 +833,7 @@
           <w:footerReference w:type="default" r:id="rId10"/>
           <w:type w:val="nextPage"/>
           <w:pgSz w:w="11906" w:h="16838"/>
-          <w:pgMar w:top="1440" w:right="1474" w:bottom="1440" w:left="1474" w:header="851" w:footer="992" w:gutter="0"/>
+          <w:pgMar w:top="1134" w:right="1474" w:bottom="1134" w:left="1474" w:header="851" w:footer="992" w:gutter="0"/>
           <w:pgNumType w:fmt="decimal" w:start="1"/>
           <w:cols w:space="720"/>
           <w:formProt w:val="0"/>
@@ -864,9 +865,10 @@
             <w:rPr>
               <w:rFonts w:eastAsia="黑体"/>
               <w:b/>
+              <w:bCs/>
+              <w:color w:val="7F7F7F"/>
               <w:sz w:val="36"/>
               <w:szCs w:val="36"/>
-              <w:bCs/>
             </w:rPr>
             <w:t>【毕业论文（设计）中文题目】</w:t>
           </w:r>
@@ -900,6 +902,7 @@
         <w:sdtContent>
           <w:r>
             <w:rPr>
+              <w:color w:val="7F7F7F"/>
               <w:szCs w:val="21"/>
             </w:rPr>
             <w:t>【姓名】</w:t>
@@ -934,6 +937,7 @@
         <w:sdtContent>
           <w:r>
             <w:rPr>
+              <w:color w:val="7F7F7F"/>
               <w:szCs w:val="21"/>
             </w:rPr>
             <w:t>【姓名及职称】</w:t>
@@ -969,6 +973,7 @@
           <w:r>
             <w:rPr>
               <w:bCs/>
+              <w:color w:val="7F7F7F"/>
               <w:szCs w:val="21"/>
             </w:rPr>
             <w:t>【学院名称】</w:t>
@@ -1015,6 +1020,9 @@
           <w:r>
             <w:rPr>
               <w:rFonts w:ascii="Times New Roman" w:hAnsi="Times New Roman" w:cs="Times New Roman" w:eastAsia="宋体"/>
+              <w:b w:val="0"/>
+              <w:bCs w:val="0"/>
+              <w:color w:val="7F7F7F"/>
               <w:szCs w:val="21"/>
               <w:sz w:val="21"/>
             </w:rPr>
@@ -1073,6 +1081,7 @@
           <w:r>
             <w:rPr>
               <w:rFonts w:ascii="Times New Roman" w:hAnsi="Times New Roman" w:cs="Times New Roman" w:eastAsia="宋体"/>
+              <w:color w:val="7F7F7F"/>
               <w:szCs w:val="21"/>
               <w:sz w:val="21"/>
             </w:rPr>
@@ -1122,9 +1131,10 @@
             <w:rPr>
               <w:rFonts w:ascii="Times New Roman" w:hAnsi="Times New Roman" w:cs="Times New Roman"/>
               <w:b/>
+              <w:bCs/>
+              <w:color w:val="7F7F7F"/>
               <w:sz w:val="28"/>
               <w:szCs w:val="28"/>
-              <w:bCs/>
             </w:rPr>
             <w:t>【Title of Graduation Paper】</w:t>
           </w:r>
@@ -1159,6 +1169,7 @@
           <w:r>
             <w:rPr>
               <w:rFonts w:ascii="Times New Roman" w:hAnsi="Times New Roman" w:cs="Times New Roman"/>
+              <w:color w:val="7F7F7F"/>
               <w:szCs w:val="21"/>
               <w:sz w:val="21"/>
             </w:rPr>
@@ -1195,6 +1206,7 @@
           <w:r>
             <w:rPr>
               <w:rFonts w:ascii="Times New Roman" w:hAnsi="Times New Roman" w:cs="Times New Roman"/>
+              <w:color w:val="7F7F7F"/>
               <w:szCs w:val="21"/>
               <w:sz w:val="21"/>
             </w:rPr>
@@ -1231,6 +1243,7 @@
           <w:r>
             <w:rPr>
               <w:rFonts w:ascii="Times New Roman" w:hAnsi="Times New Roman" w:cs="Times New Roman"/>
+              <w:color w:val="7F7F7F"/>
               <w:szCs w:val="21"/>
               <w:sz w:val="21"/>
             </w:rPr>
@@ -1278,6 +1291,7 @@
           <w:r>
             <w:rPr>
               <w:rFonts w:ascii="Times New Roman" w:hAnsi="Times New Roman" w:cs="Times New Roman"/>
+              <w:color w:val="7F7F7F"/>
               <w:sz w:val="21"/>
               <w:szCs w:val="21"/>
             </w:rPr>
@@ -1317,6 +1331,7 @@
           <w:r>
             <w:rPr>
               <w:rFonts w:ascii="Times New Roman" w:hAnsi="Times New Roman" w:cs="Times New Roman"/>
+              <w:color w:val="7F7F7F"/>
               <w:szCs w:val="21"/>
               <w:sz w:val="21"/>
             </w:rPr>
@@ -1327,28 +1342,208 @@
     </w:p>
     <w:sdt>
       <w:sdtPr>
-        <w:alias w:val="body.chapters"/>
-        <w:tag w:val="docfit.body.main"/>
+        <w:alias w:val="body.heading.level1"/>
+        <w:tag w:val="docfit.body.chapter_title"/>
         <w:id w:val="200021"/>
+        <w:showingPlcHdr/>
+        <w:text/>
+      </w:sdtPr>
+      <w:sdtContent>
+        <w:p>
+          <w:pPr>
+            <w:pStyle w:val="DocFitHeading1"/>
+            <w:keepNext/>
+            <w:widowControl w:val="0"/>
+            <w:spacing w:before="440" w:after="0" w:line="440" w:lineRule="exact"/>
+            <w:jc w:val="left"/>
+            <w:outlineLvl w:val="0"/>
+          </w:pPr>
+          <w:r>
+            <w:rPr>
+              <w:color w:val="7F7F7F"/>
+            </w:rPr>
+            <w:t>1 章节标题</w:t>
+          </w:r>
+        </w:p>
+      </w:sdtContent>
+    </w:sdt>
+    <w:sdt>
+      <w:sdtPr>
+        <w:alias w:val="body.paragraph"/>
+        <w:tag w:val="docfit.body.chapter_body"/>
+        <w:id w:val="200025"/>
         <w:showingPlcHdr/>
       </w:sdtPr>
       <w:sdtContent>
         <w:p>
           <w:pPr>
             <w:pStyle w:val="DocFitBody"/>
-            <w:spacing w:before="440" w:after="0" w:line="440" w:lineRule="exact"/>
+            <w:widowControl w:val="0"/>
+            <w:spacing w:before="0" w:after="0" w:line="440" w:lineRule="exact"/>
+            <w:ind w:firstLineChars="200" w:firstLine="480"/>
             <w:jc w:val="both"/>
-            <w:rPr>
-              <w:sz w:val="18"/>
-              <w:szCs w:val="18"/>
-            </w:rPr>
           </w:pPr>
           <w:r>
             <w:rPr>
-              <w:sz w:val="24"/>
-              <w:szCs w:val="20"/>
+              <w:color w:val="7F7F7F"/>
             </w:rPr>
-            <w:t>【正文内容】</w:t>
+            <w:t>【请填写章节正文】</w:t>
+          </w:r>
+        </w:p>
+      </w:sdtContent>
+    </w:sdt>
+    <w:sdt>
+      <w:sdtPr>
+        <w:alias w:val="body.heading.level2"/>
+        <w:tag w:val="docfit.body.section_title"/>
+        <w:id w:val="200026"/>
+        <w:showingPlcHdr/>
+        <w:text/>
+      </w:sdtPr>
+      <w:sdtContent>
+        <w:p>
+          <w:pPr>
+            <w:pStyle w:val="DocFitHeading2"/>
+            <w:keepNext/>
+            <w:widowControl w:val="0"/>
+            <w:spacing w:before="0" w:after="0" w:line="440" w:lineRule="exact"/>
+            <w:jc w:val="left"/>
+            <w:outlineLvl w:val="1"/>
+          </w:pPr>
+          <w:r>
+            <w:rPr>
+              <w:color w:val="7F7F7F"/>
+            </w:rPr>
+            <w:t>1.1 节标题</w:t>
+          </w:r>
+        </w:p>
+      </w:sdtContent>
+    </w:sdt>
+    <w:sdt>
+      <w:sdtPr>
+        <w:alias w:val="body.paragraph"/>
+        <w:tag w:val="docfit.body.section_body"/>
+        <w:id w:val="200027"/>
+        <w:showingPlcHdr/>
+      </w:sdtPr>
+      <w:sdtContent>
+        <w:p>
+          <w:pPr>
+            <w:pStyle w:val="DocFitBody"/>
+            <w:widowControl w:val="0"/>
+            <w:spacing w:before="0" w:after="0" w:line="440" w:lineRule="exact"/>
+            <w:ind w:firstLineChars="200" w:firstLine="480"/>
+            <w:jc w:val="both"/>
+          </w:pPr>
+          <w:r>
+            <w:rPr>
+              <w:color w:val="7F7F7F"/>
+            </w:rPr>
+            <w:t>【请填写本节正文】</w:t>
+          </w:r>
+        </w:p>
+      </w:sdtContent>
+    </w:sdt>
+    <w:sdt>
+      <w:sdtPr>
+        <w:alias w:val="body.heading.level3"/>
+        <w:tag w:val="docfit.body.subsection_title"/>
+        <w:id w:val="200028"/>
+        <w:showingPlcHdr/>
+        <w:text/>
+      </w:sdtPr>
+      <w:sdtContent>
+        <w:p>
+          <w:pPr>
+            <w:pStyle w:val="DocFitHeading3"/>
+            <w:keepNext/>
+            <w:widowControl w:val="0"/>
+            <w:spacing w:before="0" w:after="0" w:line="440" w:lineRule="exact"/>
+            <w:jc w:val="left"/>
+            <w:outlineLvl w:val="2"/>
+          </w:pPr>
+          <w:r>
+            <w:rPr>
+              <w:color w:val="7F7F7F"/>
+            </w:rPr>
+            <w:t>1.1.1 小节标题</w:t>
+          </w:r>
+        </w:p>
+      </w:sdtContent>
+    </w:sdt>
+    <w:sdt>
+      <w:sdtPr>
+        <w:alias w:val="body.paragraph"/>
+        <w:tag w:val="docfit.body.subsection_body"/>
+        <w:id w:val="200029"/>
+        <w:showingPlcHdr/>
+      </w:sdtPr>
+      <w:sdtContent>
+        <w:p>
+          <w:pPr>
+            <w:pStyle w:val="DocFitBody"/>
+            <w:widowControl w:val="0"/>
+            <w:spacing w:before="0" w:after="0" w:line="440" w:lineRule="exact"/>
+            <w:ind w:firstLineChars="200" w:firstLine="480"/>
+            <w:jc w:val="both"/>
+          </w:pPr>
+          <w:r>
+            <w:rPr>
+              <w:color w:val="7F7F7F"/>
+            </w:rPr>
+            <w:t>【请填写本小节正文】</w:t>
+          </w:r>
+        </w:p>
+      </w:sdtContent>
+    </w:sdt>
+    <w:sdt>
+      <w:sdtPr>
+        <w:alias w:val="body.heading.level1"/>
+        <w:tag w:val="docfit.conclusion.title"/>
+        <w:id w:val="200030"/>
+        <w:showingPlcHdr/>
+        <w:text/>
+      </w:sdtPr>
+      <w:sdtContent>
+        <w:p>
+          <w:pPr>
+            <w:pStyle w:val="DocFitHeading1"/>
+            <w:keepNext/>
+            <w:widowControl w:val="0"/>
+            <w:spacing w:before="0" w:after="0" w:line="440" w:lineRule="exact"/>
+            <w:jc w:val="left"/>
+            <w:outlineLvl w:val="0"/>
+          </w:pPr>
+          <w:r>
+            <w:rPr>
+              <w:color w:val="7F7F7F"/>
+            </w:rPr>
+            <w:t>5 结论</w:t>
+          </w:r>
+        </w:p>
+      </w:sdtContent>
+    </w:sdt>
+    <w:sdt>
+      <w:sdtPr>
+        <w:alias w:val="body.paragraph"/>
+        <w:tag w:val="docfit.conclusion.body"/>
+        <w:id w:val="200031"/>
+        <w:showingPlcHdr/>
+      </w:sdtPr>
+      <w:sdtContent>
+        <w:p>
+          <w:pPr>
+            <w:pStyle w:val="DocFitBody"/>
+            <w:widowControl w:val="0"/>
+            <w:spacing w:before="0" w:after="0" w:line="440" w:lineRule="exact"/>
+            <w:ind w:firstLineChars="200" w:firstLine="480"/>
+            <w:jc w:val="both"/>
+          </w:pPr>
+          <w:r>
+            <w:rPr>
+              <w:color w:val="7F7F7F"/>
+            </w:rPr>
+            <w:t>【请填写结论正文】</w:t>
           </w:r>
         </w:p>
       </w:sdtContent>
@@ -1392,6 +1587,7 @@
           </w:pPr>
           <w:r>
             <w:rPr>
+              <w:color w:val="7F7F7F"/>
               <w:szCs w:val="21"/>
             </w:rPr>
             <w:t>【参考文献条目】</w:t>
@@ -1441,6 +1637,7 @@
           </w:pPr>
           <w:r>
             <w:rPr>
+              <w:color w:val="7F7F7F"/>
               <w:sz w:val="24"/>
             </w:rPr>
             <w:t>【致谢内容】</w:t>
@@ -1490,6 +1687,7 @@
           <w:r>
             <w:rPr>
               <w:rFonts w:cs="宋体"/>
+              <w:color w:val="7F7F7F"/>
               <w:sz w:val="24"/>
             </w:rPr>
             <w:t>【附录内容】</w:t>
@@ -1506,7 +1704,7 @@
           <w:footerReference w:type="default" r:id="rId10"/>
           <w:type w:val="nextPage"/>
           <w:pgSz w:w="11906" w:h="16838"/>
-          <w:pgMar w:top="1440" w:right="1474" w:bottom="1440" w:left="1474" w:header="851" w:footer="992" w:gutter="0"/>
+          <w:pgMar w:top="1134" w:right="1474" w:bottom="1134" w:left="1474" w:header="851" w:footer="992" w:gutter="0"/>
           <w:pgNumType w:fmt="decimal" w:start="1"/>
           <w:cols w:space="720"/>
           <w:formProt w:val="0"/>

</xml_diff>

<commit_message>
refactor(agent): adopt skill-first template extraction
</commit_message>
<xml_diff>
--- a/evals/template-extraction/cases/01-hunau-undergraduate/gold/template.docx
+++ b/evals/template-extraction/cases/01-hunau-undergraduate/gold/template.docx
@@ -1,6 +1,6 @@
 
 <file path=word/document.xml><?xml version="1.0" encoding="utf-8"?>
-<w:document xmlns:wpc="http://schemas.microsoft.com/office/word/2010/wordprocessingCanvas" xmlns:cx="http://schemas.microsoft.com/office/drawing/2014/chartex" xmlns:cx1="http://schemas.microsoft.com/office/drawing/2015/9/8/chartex" xmlns:cx2="http://schemas.microsoft.com/office/drawing/2015/10/21/chartex" xmlns:cx3="http://schemas.microsoft.com/office/drawing/2016/5/9/chartex" xmlns:cx4="http://schemas.microsoft.com/office/drawing/2016/5/10/chartex" xmlns:cx5="http://schemas.microsoft.com/office/drawing/2016/5/11/chartex" xmlns:cx6="http://schemas.microsoft.com/office/drawing/2016/5/12/chartex" xmlns:cx7="http://schemas.microsoft.com/office/drawing/2016/5/13/chartex" xmlns:cx8="http://schemas.microsoft.com/office/drawing/2016/5/14/chartex" xmlns:mc="http://schemas.openxmlformats.org/markup-compatibility/2006" xmlns:m="http://schemas.openxmlformats.org/officeDocument/2006/math" xmlns:aink="http://schemas.microsoft.com/office/drawing/2016/ink" xmlns:am3d="http://schemas.microsoft.com/office/drawing/2017/model3d" xmlns:oel="http://schemas.microsoft.com/office/2019/extlst" xmlns:r="http://schemas.openxmlformats.org/officeDocument/2006/relationships" xmlns:wp14="http://schemas.microsoft.com/office/word/2010/wordprocessingDrawing" xmlns:wp="http://schemas.openxmlformats.org/drawingml/2006/wordprocessingDrawing" xmlns:wpg="http://schemas.microsoft.com/office/word/2010/wordprocessingGroup" xmlns:wpi="http://schemas.microsoft.com/office/word/2010/wordprocessingInk" xmlns:wps="http://schemas.microsoft.com/office/word/2010/wordprocessingShape" xmlns:o="urn:schemas-microsoft-com:office:office" xmlns:v="urn:schemas-microsoft-com:vml" xmlns:w10="urn:schemas-microsoft-com:office:word" xmlns:w="http://schemas.openxmlformats.org/wordprocessingml/2006/main" xmlns:w14="http://schemas.microsoft.com/office/word/2010/wordml" xmlns:w15="http://schemas.microsoft.com/office/word/2012/wordml" xmlns:w16cei="http://schemas.microsoft.com/office/word/2026/wordml/cei" xmlns:w16cex="http://schemas.microsoft.com/office/word/2018/wordml/cex" xmlns:w16cid="http://schemas.microsoft.com/office/word/2016/wordml/cid" xmlns:w16="http://schemas.microsoft.com/office/word/2018/wordml" xmlns:w16sdtdh="http://schemas.microsoft.com/office/word/2020/wordml/sdtdatahash" xmlns:w16sdtfl="http://schemas.microsoft.com/office/word/2024/wordml/sdtformatlock" xmlns:w16se="http://schemas.microsoft.com/office/word/2015/wordml/symex" xmlns:w16du="http://schemas.microsoft.com/office/word/2023/wordml/word16du" xmlns:wne="http://schemas.microsoft.com/office/word/2006/wordml" mc:Ignorable="w14 w15 w16se w16cid w16 w16cex w16sdtdh w16sdtfl w16du wp14">
+<w:document xmlns:mc="http://schemas.openxmlformats.org/markup-compatibility/2006" xmlns:r="http://schemas.openxmlformats.org/officeDocument/2006/relationships" xmlns:w="http://schemas.openxmlformats.org/wordprocessingml/2006/main" xmlns:w14="http://schemas.microsoft.com/office/word/2010/wordml" xmlns:wpc="http://schemas.microsoft.com/office/word/2010/wordprocessingCanvas" xmlns:cx="http://schemas.microsoft.com/office/drawing/2014/chartex" xmlns:cx1="http://schemas.microsoft.com/office/drawing/2015/9/8/chartex" xmlns:cx2="http://schemas.microsoft.com/office/drawing/2015/10/21/chartex" xmlns:cx3="http://schemas.microsoft.com/office/drawing/2016/5/9/chartex" xmlns:cx4="http://schemas.microsoft.com/office/drawing/2016/5/10/chartex" xmlns:cx5="http://schemas.microsoft.com/office/drawing/2016/5/11/chartex" xmlns:cx6="http://schemas.microsoft.com/office/drawing/2016/5/12/chartex" xmlns:cx7="http://schemas.microsoft.com/office/drawing/2016/5/13/chartex" xmlns:cx8="http://schemas.microsoft.com/office/drawing/2016/5/14/chartex" xmlns:m="http://schemas.openxmlformats.org/officeDocument/2006/math" xmlns:aink="http://schemas.microsoft.com/office/drawing/2016/ink" xmlns:am3d="http://schemas.microsoft.com/office/drawing/2017/model3d" xmlns:oel="http://schemas.microsoft.com/office/2019/extlst" xmlns:wp14="http://schemas.microsoft.com/office/word/2010/wordprocessingDrawing" xmlns:wp="http://schemas.openxmlformats.org/drawingml/2006/wordprocessingDrawing" xmlns:wpg="http://schemas.microsoft.com/office/word/2010/wordprocessingGroup" xmlns:wpi="http://schemas.microsoft.com/office/word/2010/wordprocessingInk" xmlns:wps="http://schemas.microsoft.com/office/word/2010/wordprocessingShape" xmlns:o="urn:schemas-microsoft-com:office:office" xmlns:v="urn:schemas-microsoft-com:vml" xmlns:w10="urn:schemas-microsoft-com:office:word" xmlns:w15="http://schemas.microsoft.com/office/word/2012/wordml" xmlns:w16cei="http://schemas.microsoft.com/office/word/2026/wordml/cei" xmlns:w16cex="http://schemas.microsoft.com/office/word/2018/wordml/cex" xmlns:w16cid="http://schemas.microsoft.com/office/word/2016/wordml/cid" xmlns:w16="http://schemas.microsoft.com/office/word/2018/wordml" xmlns:w16sdtdh="http://schemas.microsoft.com/office/word/2020/wordml/sdtdatahash" xmlns:w16sdtfl="http://schemas.microsoft.com/office/word/2024/wordml/sdtformatlock" xmlns:w16se="http://schemas.microsoft.com/office/word/2015/wordml/symex" xmlns:w16du="http://schemas.microsoft.com/office/word/2023/wordml/word16du" xmlns:wne="http://schemas.microsoft.com/office/word/2006/wordml" mc:Ignorable="w14 w15 w16se w16cid w16 w16cex w16sdtdh w16sdtfl w16du wp14">
   <w:body>
     <w:p>
       <w:pPr>
@@ -109,7 +109,7 @@
               <w:rFonts w:eastAsia="黑体"/>
               <w:b/>
               <w:bCs/>
-              <w:color w:val="7F7F7F"/>
+              <w:color w:val="000000"/>
               <w:sz w:val="36"/>
               <w:szCs w:val="36"/>
             </w:rPr>
@@ -143,7 +143,7 @@
               <w:rFonts w:ascii="Times New Roman" w:hAnsi="Times New Roman" w:cs="Times New Roman"/>
               <w:b/>
               <w:bCs/>
-              <w:color w:val="7F7F7F"/>
+              <w:color w:val="000000"/>
               <w:sz w:val="28"/>
               <w:szCs w:val="28"/>
             </w:rPr>
@@ -229,7 +229,7 @@
               <w:rFonts w:eastAsia="楷体_GB2312;楷体"/>
               <w:b/>
               <w:bCs/>
-              <w:color w:val="7F7F7F"/>
+              <w:color w:val="000000"/>
               <w:sz w:val="32"/>
               <w:szCs w:val="32"/>
             </w:rPr>
@@ -276,7 +276,7 @@
               <w:rFonts w:eastAsia="楷体_GB2312;楷体"/>
               <w:b/>
               <w:bCs/>
-              <w:color w:val="7F7F7F"/>
+              <w:color w:val="000000"/>
               <w:sz w:val="32"/>
               <w:szCs w:val="32"/>
             </w:rPr>
@@ -323,7 +323,7 @@
               <w:rFonts w:eastAsia="楷体_GB2312;楷体"/>
               <w:b/>
               <w:bCs/>
-              <w:color w:val="7F7F7F"/>
+              <w:color w:val="000000"/>
               <w:sz w:val="32"/>
               <w:szCs w:val="32"/>
             </w:rPr>
@@ -370,7 +370,7 @@
               <w:rFonts w:eastAsia="楷体_GB2312;楷体"/>
               <w:b/>
               <w:bCs/>
-              <w:color w:val="7F7F7F"/>
+              <w:color w:val="000000"/>
               <w:sz w:val="32"/>
               <w:szCs w:val="32"/>
             </w:rPr>
@@ -417,7 +417,7 @@
               <w:rFonts w:eastAsia="楷体_GB2312;楷体"/>
               <w:b/>
               <w:bCs/>
-              <w:color w:val="7F7F7F"/>
+              <w:color w:val="000000"/>
               <w:sz w:val="32"/>
               <w:szCs w:val="32"/>
             </w:rPr>
@@ -521,7 +521,7 @@
           <w:r>
             <w:rPr>
               <w:rFonts w:eastAsia="黑体"/>
-              <w:color w:val="7F7F7F"/>
+              <w:color w:val="000000"/>
               <w:sz w:val="30"/>
               <w:szCs w:val="30"/>
             </w:rPr>
@@ -809,9 +809,9 @@
       <w:r>
         <w:rPr>
           <w:rFonts w:ascii="Times New Roman" w:hAnsi="Times New Roman" w:cs="Times New Roman" w:eastAsia="宋体"/>
+          <w:color w:val="808080"/>
           <w:sz w:val="24"/>
           <w:szCs w:val="24"/>
-          <w:color w:val="808080"/>
         </w:rPr>
         <w:t>【自动目录】</w:t>
       </w:r>
@@ -866,7 +866,7 @@
               <w:rFonts w:eastAsia="黑体"/>
               <w:b/>
               <w:bCs/>
-              <w:color w:val="7F7F7F"/>
+              <w:color w:val="000000"/>
               <w:sz w:val="36"/>
               <w:szCs w:val="36"/>
             </w:rPr>
@@ -902,7 +902,7 @@
         <w:sdtContent>
           <w:r>
             <w:rPr>
-              <w:color w:val="7F7F7F"/>
+              <w:color w:val="000000"/>
               <w:szCs w:val="21"/>
             </w:rPr>
             <w:t>【姓名】</w:t>
@@ -937,7 +937,7 @@
         <w:sdtContent>
           <w:r>
             <w:rPr>
-              <w:color w:val="7F7F7F"/>
+              <w:color w:val="000000"/>
               <w:szCs w:val="21"/>
             </w:rPr>
             <w:t>【姓名及职称】</w:t>
@@ -973,7 +973,7 @@
           <w:r>
             <w:rPr>
               <w:bCs/>
-              <w:color w:val="7F7F7F"/>
+              <w:color w:val="000000"/>
               <w:szCs w:val="21"/>
             </w:rPr>
             <w:t>【学院名称】</w:t>
@@ -1001,9 +1001,9 @@
       <w:r>
         <w:rPr>
           <w:rFonts w:eastAsia="黑体"/>
+          <w:b/>
           <w:bCs/>
           <w:sz w:val="24"/>
-          <w:b/>
           <w:szCs w:val="24"/>
         </w:rPr>
         <w:t xml:space="preserve">摘  要：</w:t>
@@ -1022,9 +1022,9 @@
               <w:rFonts w:ascii="Times New Roman" w:hAnsi="Times New Roman" w:cs="Times New Roman" w:eastAsia="宋体"/>
               <w:b w:val="0"/>
               <w:bCs w:val="0"/>
-              <w:color w:val="7F7F7F"/>
+              <w:color w:val="000000"/>
+              <w:sz w:val="21"/>
               <w:szCs w:val="21"/>
-              <w:sz w:val="21"/>
             </w:rPr>
             <w:t>【中文摘要内容】</w:t>
           </w:r>
@@ -1062,9 +1062,9 @@
       <w:r>
         <w:rPr>
           <w:rFonts w:eastAsia="黑体"/>
+          <w:b/>
           <w:bCs/>
           <w:sz w:val="24"/>
-          <w:b/>
           <w:szCs w:val="24"/>
         </w:rPr>
         <w:t>关键词：</w:t>
@@ -1081,9 +1081,9 @@
           <w:r>
             <w:rPr>
               <w:rFonts w:ascii="Times New Roman" w:hAnsi="Times New Roman" w:cs="Times New Roman" w:eastAsia="宋体"/>
-              <w:color w:val="7F7F7F"/>
+              <w:color w:val="000000"/>
+              <w:sz w:val="21"/>
               <w:szCs w:val="21"/>
-              <w:sz w:val="21"/>
             </w:rPr>
             <w:t>【关键词1；关键词2；关键词3】</w:t>
           </w:r>
@@ -1132,7 +1132,7 @@
               <w:rFonts w:ascii="Times New Roman" w:hAnsi="Times New Roman" w:cs="Times New Roman"/>
               <w:b/>
               <w:bCs/>
-              <w:color w:val="7F7F7F"/>
+              <w:color w:val="000000"/>
               <w:sz w:val="28"/>
               <w:szCs w:val="28"/>
             </w:rPr>
@@ -1152,8 +1152,8 @@
       <w:r>
         <w:rPr>
           <w:rFonts w:ascii="Times New Roman" w:hAnsi="Times New Roman" w:cs="Times New Roman"/>
+          <w:sz w:val="21"/>
           <w:szCs w:val="21"/>
-          <w:sz w:val="21"/>
         </w:rPr>
         <w:t xml:space="preserve">Student: </w:t>
       </w:r>
@@ -1169,9 +1169,9 @@
           <w:r>
             <w:rPr>
               <w:rFonts w:ascii="Times New Roman" w:hAnsi="Times New Roman" w:cs="Times New Roman"/>
-              <w:color w:val="7F7F7F"/>
+              <w:color w:val="000000"/>
+              <w:sz w:val="21"/>
               <w:szCs w:val="21"/>
-              <w:sz w:val="21"/>
             </w:rPr>
             <w:t>【Name】</w:t>
           </w:r>
@@ -1189,8 +1189,8 @@
       <w:r>
         <w:rPr>
           <w:rFonts w:ascii="Times New Roman" w:hAnsi="Times New Roman" w:cs="Times New Roman"/>
+          <w:sz w:val="21"/>
           <w:szCs w:val="21"/>
-          <w:sz w:val="21"/>
         </w:rPr>
         <w:t xml:space="preserve">Tutor: </w:t>
       </w:r>
@@ -1206,9 +1206,9 @@
           <w:r>
             <w:rPr>
               <w:rFonts w:ascii="Times New Roman" w:hAnsi="Times New Roman" w:cs="Times New Roman"/>
-              <w:color w:val="7F7F7F"/>
+              <w:color w:val="000000"/>
+              <w:sz w:val="21"/>
               <w:szCs w:val="21"/>
-              <w:sz w:val="21"/>
             </w:rPr>
             <w:t>【Name and Title】</w:t>
           </w:r>
@@ -1226,8 +1226,8 @@
       <w:r>
         <w:rPr>
           <w:rFonts w:ascii="Times New Roman" w:hAnsi="Times New Roman" w:cs="Times New Roman"/>
+          <w:sz w:val="21"/>
           <w:szCs w:val="21"/>
-          <w:sz w:val="21"/>
         </w:rPr>
         <w:t xml:space="preserve">(College of </w:t>
       </w:r>
@@ -1243,9 +1243,9 @@
           <w:r>
             <w:rPr>
               <w:rFonts w:ascii="Times New Roman" w:hAnsi="Times New Roman" w:cs="Times New Roman"/>
-              <w:color w:val="7F7F7F"/>
+              <w:color w:val="000000"/>
+              <w:sz w:val="21"/>
               <w:szCs w:val="21"/>
-              <w:sz w:val="21"/>
             </w:rPr>
             <w:t>【College Name】</w:t>
           </w:r>
@@ -1254,8 +1254,8 @@
       <w:r>
         <w:rPr>
           <w:rFonts w:ascii="Times New Roman" w:hAnsi="Times New Roman" w:cs="Times New Roman"/>
+          <w:sz w:val="21"/>
           <w:szCs w:val="21"/>
-          <w:sz w:val="21"/>
         </w:rPr>
         <w:t>, Hunan Agricultural University, Changsha 410128, China)</w:t>
       </w:r>
@@ -1291,7 +1291,7 @@
           <w:r>
             <w:rPr>
               <w:rFonts w:ascii="Times New Roman" w:hAnsi="Times New Roman" w:cs="Times New Roman"/>
-              <w:color w:val="7F7F7F"/>
+              <w:color w:val="000000"/>
               <w:sz w:val="21"/>
               <w:szCs w:val="21"/>
             </w:rPr>
@@ -1331,9 +1331,9 @@
           <w:r>
             <w:rPr>
               <w:rFonts w:ascii="Times New Roman" w:hAnsi="Times New Roman" w:cs="Times New Roman"/>
-              <w:color w:val="7F7F7F"/>
+              <w:color w:val="000000"/>
+              <w:sz w:val="21"/>
               <w:szCs w:val="21"/>
-              <w:sz w:val="21"/>
             </w:rPr>
             <w:t>【keyword 1; keyword 2; keyword 3】</w:t>
           </w:r>
@@ -1342,7 +1342,7 @@
     </w:p>
     <w:sdt>
       <w:sdtPr>
-        <w:alias w:val="body.heading.level1"/>
+        <w:alias w:val="body.heading.outline1"/>
         <w:tag w:val="docfit.body.chapter_title"/>
         <w:id w:val="200021"/>
         <w:showingPlcHdr/>
@@ -1360,7 +1360,7 @@
           </w:pPr>
           <w:r>
             <w:rPr>
-              <w:color w:val="7F7F7F"/>
+              <w:color w:val="000000"/>
             </w:rPr>
             <w:t>1 章节标题</w:t>
           </w:r>
@@ -1385,7 +1385,7 @@
           </w:pPr>
           <w:r>
             <w:rPr>
-              <w:color w:val="7F7F7F"/>
+              <w:color w:val="000000"/>
             </w:rPr>
             <w:t>【请填写章节正文】</w:t>
           </w:r>
@@ -1394,7 +1394,7 @@
     </w:sdt>
     <w:sdt>
       <w:sdtPr>
-        <w:alias w:val="body.heading.level2"/>
+        <w:alias w:val="body.heading.outline2"/>
         <w:tag w:val="docfit.body.section_title"/>
         <w:id w:val="200026"/>
         <w:showingPlcHdr/>
@@ -1412,7 +1412,7 @@
           </w:pPr>
           <w:r>
             <w:rPr>
-              <w:color w:val="7F7F7F"/>
+              <w:color w:val="000000"/>
             </w:rPr>
             <w:t>1.1 节标题</w:t>
           </w:r>
@@ -1437,7 +1437,7 @@
           </w:pPr>
           <w:r>
             <w:rPr>
-              <w:color w:val="7F7F7F"/>
+              <w:color w:val="000000"/>
             </w:rPr>
             <w:t>【请填写本节正文】</w:t>
           </w:r>
@@ -1446,7 +1446,7 @@
     </w:sdt>
     <w:sdt>
       <w:sdtPr>
-        <w:alias w:val="body.heading.level3"/>
+        <w:alias w:val="body.heading.outline3"/>
         <w:tag w:val="docfit.body.subsection_title"/>
         <w:id w:val="200028"/>
         <w:showingPlcHdr/>
@@ -1464,7 +1464,7 @@
           </w:pPr>
           <w:r>
             <w:rPr>
-              <w:color w:val="7F7F7F"/>
+              <w:color w:val="000000"/>
             </w:rPr>
             <w:t>1.1.1 小节标题</w:t>
           </w:r>
@@ -1489,7 +1489,7 @@
           </w:pPr>
           <w:r>
             <w:rPr>
-              <w:color w:val="7F7F7F"/>
+              <w:color w:val="000000"/>
             </w:rPr>
             <w:t>【请填写本小节正文】</w:t>
           </w:r>
@@ -1498,7 +1498,7 @@
     </w:sdt>
     <w:sdt>
       <w:sdtPr>
-        <w:alias w:val="body.heading.level1"/>
+        <w:alias w:val="body.heading.outline1"/>
         <w:tag w:val="docfit.conclusion.title"/>
         <w:id w:val="200030"/>
         <w:showingPlcHdr/>
@@ -1516,7 +1516,7 @@
           </w:pPr>
           <w:r>
             <w:rPr>
-              <w:color w:val="7F7F7F"/>
+              <w:color w:val="000000"/>
             </w:rPr>
             <w:t>5 结论</w:t>
           </w:r>
@@ -1541,7 +1541,7 @@
           </w:pPr>
           <w:r>
             <w:rPr>
-              <w:color w:val="7F7F7F"/>
+              <w:color w:val="000000"/>
             </w:rPr>
             <w:t>【请填写结论正文】</w:t>
           </w:r>
@@ -1582,12 +1582,13 @@
             <w:spacing w:line="440" w:lineRule="exact"/>
             <w:ind w:right="210"/>
             <w:rPr>
+              <w:color w:val="000000"/>
               <w:szCs w:val="21"/>
             </w:rPr>
           </w:pPr>
           <w:r>
             <w:rPr>
-              <w:color w:val="7F7F7F"/>
+              <w:color w:val="000000"/>
               <w:szCs w:val="21"/>
             </w:rPr>
             <w:t>【参考文献条目】</w:t>
@@ -1632,12 +1633,13 @@
             <w:ind w:firstLineChars="200" w:firstLine="480"/>
             <w:jc w:val="both"/>
             <w:rPr>
+              <w:color w:val="000000"/>
               <w:sz w:val="24"/>
             </w:rPr>
           </w:pPr>
           <w:r>
             <w:rPr>
-              <w:color w:val="7F7F7F"/>
+              <w:color w:val="000000"/>
               <w:sz w:val="24"/>
             </w:rPr>
             <w:t>【致谢内容】</w:t>
@@ -1681,13 +1683,14 @@
             <w:spacing w:line="440" w:lineRule="exact"/>
             <w:jc w:val="both"/>
             <w:rPr>
+              <w:color w:val="000000"/>
               <w:sz w:val="24"/>
             </w:rPr>
           </w:pPr>
           <w:r>
             <w:rPr>
               <w:rFonts w:cs="宋体"/>
-              <w:color w:val="7F7F7F"/>
+              <w:color w:val="000000"/>
               <w:sz w:val="24"/>
             </w:rPr>
             <w:t>【附录内容】</w:t>

</xml_diff>

<commit_message>
refactor(agent): complete agent-first template architecture
</commit_message>
<xml_diff>
--- a/evals/template-extraction/cases/01-hunau-undergraduate/gold/template.docx
+++ b/evals/template-extraction/cases/01-hunau-undergraduate/gold/template.docx
@@ -794,8 +794,7 @@
     </w:p>
     <w:p>
       <w:pPr>
-        <w:spacing w:before="0" w:after="0" w:line="460" w:lineRule="exact"/>
-        <w:jc w:val="center"/>
+        <w:pStyle w:val="TOC1"/>
       </w:pPr>
       <w:r>
         <w:fldChar w:fldCharType="begin" w:dirty="true"/>
@@ -807,13 +806,125 @@
         <w:fldChar w:fldCharType="separate"/>
       </w:r>
       <w:r>
-        <w:rPr>
-          <w:rFonts w:ascii="Times New Roman" w:hAnsi="Times New Roman" w:cs="Times New Roman" w:eastAsia="宋体"/>
-          <w:color w:val="808080"/>
-          <w:sz w:val="24"/>
-          <w:szCs w:val="24"/>
-        </w:rPr>
-        <w:t>【自动目录】</w:t>
+        <w:t>摘要</w:t>
+      </w:r>
+      <w:r>
+        <w:tab/>
+      </w:r>
+      <w:r>
+        <w:t>1</w:t>
+      </w:r>
+    </w:p>
+    <w:p>
+      <w:pPr>
+        <w:pStyle w:val="TOC1"/>
+      </w:pPr>
+      <w:r>
+        <w:t>关键词</w:t>
+      </w:r>
+      <w:r>
+        <w:tab/>
+      </w:r>
+      <w:r>
+        <w:t>1</w:t>
+      </w:r>
+    </w:p>
+    <w:p>
+      <w:pPr>
+        <w:pStyle w:val="TOC1"/>
+      </w:pPr>
+      <w:r>
+        <w:t>1 章节标题</w:t>
+      </w:r>
+      <w:r>
+        <w:tab/>
+      </w:r>
+      <w:r>
+        <w:t>1</w:t>
+      </w:r>
+    </w:p>
+    <w:p>
+      <w:pPr>
+        <w:pStyle w:val="TOC2"/>
+      </w:pPr>
+      <w:r>
+        <w:t>1.1 节标题</w:t>
+      </w:r>
+      <w:r>
+        <w:tab/>
+      </w:r>
+      <w:r>
+        <w:t>1</w:t>
+      </w:r>
+    </w:p>
+    <w:p>
+      <w:pPr>
+        <w:pStyle w:val="TOC3"/>
+      </w:pPr>
+      <w:r>
+        <w:t>1.1.1 小节标题</w:t>
+      </w:r>
+      <w:r>
+        <w:tab/>
+      </w:r>
+      <w:r>
+        <w:t>1</w:t>
+      </w:r>
+    </w:p>
+    <w:p>
+      <w:pPr>
+        <w:pStyle w:val="TOC1"/>
+      </w:pPr>
+      <w:r>
+        <w:t>5 结论</w:t>
+      </w:r>
+      <w:r>
+        <w:tab/>
+      </w:r>
+      <w:r>
+        <w:t>1</w:t>
+      </w:r>
+    </w:p>
+    <w:p>
+      <w:pPr>
+        <w:pStyle w:val="TOC1"/>
+      </w:pPr>
+      <w:r>
+        <w:t>参考文献</w:t>
+      </w:r>
+      <w:r>
+        <w:tab/>
+      </w:r>
+      <w:r>
+        <w:t>2</w:t>
+      </w:r>
+    </w:p>
+    <w:p>
+      <w:pPr>
+        <w:pStyle w:val="TOC1"/>
+      </w:pPr>
+      <w:r>
+        <w:t>致谢</w:t>
+      </w:r>
+      <w:r>
+        <w:tab/>
+      </w:r>
+      <w:r>
+        <w:t>3</w:t>
+      </w:r>
+    </w:p>
+    <w:p>
+      <w:pPr>
+        <w:pStyle w:val="TOC1"/>
+      </w:pPr>
+      <w:r>
+        <w:t>附录</w:t>
+      </w:r>
+      <w:r>
+        <w:tab/>
+      </w:r>
+      <w:r>
+        <w:t>4</w:t>
       </w:r>
       <w:r>
         <w:fldChar w:fldCharType="end"/>
@@ -9699,7 +9810,7 @@
 </file>
 
 <file path=word/styles.xml><?xml version="1.0" encoding="utf-8"?>
-<w:styles xmlns:mc="http://schemas.openxmlformats.org/markup-compatibility/2006" xmlns:r="http://schemas.openxmlformats.org/officeDocument/2006/relationships" xmlns:w="http://schemas.openxmlformats.org/wordprocessingml/2006/main" xmlns:w14="http://schemas.microsoft.com/office/word/2010/wordml" xmlns:w15="http://schemas.microsoft.com/office/word/2012/wordml" xmlns:w16cex="http://schemas.microsoft.com/office/word/2018/wordml/cex" xmlns:w16cid="http://schemas.microsoft.com/office/word/2016/wordml/cid" xmlns:w16="http://schemas.microsoft.com/office/word/2018/wordml" xmlns:w16sdtdh="http://schemas.microsoft.com/office/word/2020/wordml/sdtdatahash" xmlns:w16sdtfl="http://schemas.microsoft.com/office/word/2024/wordml/sdtformatlock" xmlns:w16se="http://schemas.microsoft.com/office/word/2015/wordml/symex" xmlns:w16du="http://schemas.microsoft.com/office/word/2023/wordml/word16du" mc:Ignorable="w14 w15 w16se w16cid w16 w16cex w16sdtdh w16sdtfl w16du">
+<w:styles xmlns:mc="http://schemas.openxmlformats.org/markup-compatibility/2006" xmlns:w="http://schemas.openxmlformats.org/wordprocessingml/2006/main" xmlns:r="http://schemas.openxmlformats.org/officeDocument/2006/relationships" xmlns:w14="http://schemas.microsoft.com/office/word/2010/wordml" xmlns:w15="http://schemas.microsoft.com/office/word/2012/wordml" xmlns:w16cex="http://schemas.microsoft.com/office/word/2018/wordml/cex" xmlns:w16cid="http://schemas.microsoft.com/office/word/2016/wordml/cid" xmlns:w16="http://schemas.microsoft.com/office/word/2018/wordml" xmlns:w16sdtdh="http://schemas.microsoft.com/office/word/2020/wordml/sdtdatahash" xmlns:w16sdtfl="http://schemas.microsoft.com/office/word/2024/wordml/sdtformatlock" xmlns:w16se="http://schemas.microsoft.com/office/word/2015/wordml/symex" xmlns:w16du="http://schemas.microsoft.com/office/word/2023/wordml/word16du" mc:Ignorable="w14 w15 w16se w16cid w16 w16cex w16sdtdh w16sdtfl w16du">
   <w:docDefaults>
     <w:rPrDefault>
       <w:rPr>
@@ -10408,6 +10519,63 @@
       <w:szCs w:val="30"/>
     </w:rPr>
   </w:style>
+  <w:style w:type="paragraph" w:customStyle="1" w:styleId="TOC1">
+    <w:name w:val="toc 1"/>
+    <w:basedOn w:val="a"/>
+    <w:next w:val="a"/>
+    <w:qFormat/>
+    <w:pPr>
+      <w:tabs>
+        <w:tab w:val="right" w:leader="dot" w:pos="8958"/>
+      </w:tabs>
+      <w:spacing w:before="0" w:after="0" w:line="360" w:lineRule="auto"/>
+      <w:ind w:left="480" w:leftChars="200"/>
+    </w:pPr>
+    <w:rPr>
+      <w:rFonts w:ascii="Times New Roman" w:hAnsi="Times New Roman" w:eastAsia="宋体" w:cs="Times New Roman"/>
+      <w:color w:val="000000"/>
+      <w:sz w:val="24"/>
+      <w:szCs w:val="24"/>
+    </w:rPr>
+  </w:style>
+  <w:style w:type="paragraph" w:customStyle="1" w:styleId="TOC2">
+    <w:name w:val="toc 2"/>
+    <w:basedOn w:val="a"/>
+    <w:next w:val="a"/>
+    <w:qFormat/>
+    <w:pPr>
+      <w:tabs>
+        <w:tab w:val="right" w:leader="dot" w:pos="8958"/>
+      </w:tabs>
+      <w:spacing w:before="0" w:after="0" w:line="360" w:lineRule="auto"/>
+      <w:ind w:left="480" w:leftChars="200"/>
+    </w:pPr>
+    <w:rPr>
+      <w:rFonts w:ascii="Times New Roman" w:hAnsi="Times New Roman" w:eastAsia="宋体" w:cs="Times New Roman"/>
+      <w:color w:val="000000"/>
+      <w:sz w:val="24"/>
+      <w:szCs w:val="24"/>
+    </w:rPr>
+  </w:style>
+  <w:style w:type="paragraph" w:customStyle="1" w:styleId="TOC3">
+    <w:name w:val="toc 3"/>
+    <w:basedOn w:val="a"/>
+    <w:next w:val="a"/>
+    <w:qFormat/>
+    <w:pPr>
+      <w:tabs>
+        <w:tab w:val="right" w:leader="dot" w:pos="8958"/>
+      </w:tabs>
+      <w:spacing w:before="0" w:after="0" w:line="360" w:lineRule="auto"/>
+      <w:ind w:left="480" w:leftChars="200"/>
+    </w:pPr>
+    <w:rPr>
+      <w:rFonts w:ascii="Times New Roman" w:hAnsi="Times New Roman" w:eastAsia="宋体" w:cs="Times New Roman"/>
+      <w:color w:val="000000"/>
+      <w:sz w:val="24"/>
+      <w:szCs w:val="24"/>
+    </w:rPr>
+  </w:style>
 </w:styles>
 </file>
 

</xml_diff>